<commit_message>
Big Folder Work + reference data
</commit_message>
<xml_diff>
--- a/docs/description.docx
+++ b/docs/description.docx
@@ -1221,7 +1221,7 @@
         <w:t>– назначается</w:t>
       </w:r>
       <w:r>
-        <w:t xml:space="preserve"> суперпользователем - Редактирование/удаление любых трасс, комментариев, турниров; блокировка пользователей;</w:t>
+        <w:t xml:space="preserve"> суперпользователем - Редактирование/удаление любых трасс, турниров; блокировка пользователей;</w:t>
       </w:r>
     </w:p>
     <w:p>
@@ -1249,7 +1249,15 @@
         <w:t xml:space="preserve"> </w:t>
       </w:r>
       <w:r>
-        <w:t>через бд - Полный доступ ко всем функциям</w:t>
+        <w:t xml:space="preserve">через </w:t>
+      </w:r>
+      <w:proofErr w:type="spellStart"/>
+      <w:r>
+        <w:t>бд</w:t>
+      </w:r>
+      <w:proofErr w:type="spellEnd"/>
+      <w:r>
+        <w:t xml:space="preserve"> - Полный доступ ко всем функциям</w:t>
       </w:r>
     </w:p>
     <w:p>
@@ -1477,14 +1485,17 @@
         <w:ind w:left="0" w:firstLine="709"/>
       </w:pPr>
       <w:r>
+        <w:t>Просмотр списка автомобилей</w:t>
+      </w:r>
+      <w:r>
+        <w:t xml:space="preserve"> - </w:t>
+      </w:r>
+      <w:r>
+        <w:t xml:space="preserve">В профиле гонщика отображается гараж – все добавленные им автомобили. При просмотре </w:t>
+      </w:r>
+      <w:r>
         <w:lastRenderedPageBreak/>
-        <w:t>Просмотр списка автомобилей</w:t>
-      </w:r>
-      <w:r>
-        <w:t xml:space="preserve"> - </w:t>
-      </w:r>
-      <w:r>
-        <w:t>В профиле гонщика отображается гараж – все добавленные им автомобили. При просмотре чужого профиля список доступен для просмотра без возможности редактирования.</w:t>
+        <w:t>чужого профиля список доступен для просмотра без возможности редактирования.</w:t>
       </w:r>
     </w:p>
     <w:p>
@@ -1762,24 +1773,24 @@
           <w:b/>
           <w:bCs/>
         </w:rPr>
+        <w:t xml:space="preserve">* </w:t>
+      </w:r>
+      <w:r>
+        <w:rPr>
+          <w:b/>
+          <w:bCs/>
+        </w:rPr>
+        <w:t>Статус трассы</w:t>
+      </w:r>
+    </w:p>
+    <w:p>
+      <w:pPr>
+        <w:pStyle w:val="a7"/>
+        <w:spacing w:after="0" w:line="360" w:lineRule="auto"/>
+        <w:ind w:left="0" w:firstLine="709"/>
+      </w:pPr>
+      <w:r>
         <w:lastRenderedPageBreak/>
-        <w:t xml:space="preserve">* </w:t>
-      </w:r>
-      <w:r>
-        <w:rPr>
-          <w:b/>
-          <w:bCs/>
-        </w:rPr>
-        <w:t>Статус трассы</w:t>
-      </w:r>
-    </w:p>
-    <w:p>
-      <w:pPr>
-        <w:pStyle w:val="a7"/>
-        <w:spacing w:after="0" w:line="360" w:lineRule="auto"/>
-        <w:ind w:left="0" w:firstLine="709"/>
-      </w:pPr>
-      <w:r>
         <w:t>*.</w:t>
       </w:r>
       <w:r>
@@ -2046,14 +2057,14 @@
         <w:t>Доступно пользователям с ролью «организатор» (полученной автоматически п</w:t>
       </w:r>
       <w:r>
-        <w:t xml:space="preserve">ри создании первого турнира и, </w:t>
+        <w:t>ри создании первого турнира и, если выполнены условия</w:t>
+      </w:r>
+      <w:r>
+        <w:t xml:space="preserve">) или суперпользователю. При создании </w:t>
       </w:r>
       <w:r>
         <w:lastRenderedPageBreak/>
-        <w:t>если выполнены условия</w:t>
-      </w:r>
-      <w:r>
-        <w:t>) или суперпользователю. При создании указываются</w:t>
+        <w:t>указываются</w:t>
       </w:r>
       <w:r>
         <w:t xml:space="preserve"> основные поля, которые останутся неизменными</w:t>
@@ -2287,9 +2298,23 @@
     </w:p>
     <w:p>
       <w:pPr>
-        <w:pStyle w:val="a7"/>
-        <w:spacing w:after="0" w:line="360" w:lineRule="auto"/>
-        <w:ind w:left="0" w:firstLine="709"/>
+        <w:rPr>
+          <w:rFonts w:ascii="Consolas" w:hAnsi="Consolas"/>
+          <w:sz w:val="16"/>
+          <w:szCs w:val="16"/>
+        </w:rPr>
+      </w:pPr>
+    </w:p>
+    <w:p>
+      <w:pPr>
+        <w:pStyle w:val="a7"/>
+        <w:spacing w:after="0" w:line="240" w:lineRule="auto"/>
+        <w:ind w:left="0"/>
+        <w:rPr>
+          <w:rFonts w:ascii="Consolas" w:hAnsi="Consolas"/>
+          <w:sz w:val="16"/>
+          <w:szCs w:val="16"/>
+        </w:rPr>
       </w:pPr>
     </w:p>
     <w:sectPr>
@@ -4036,6 +4061,7 @@
   <w:style w:type="character" w:default="1" w:styleId="a0">
     <w:name w:val="Default Paragraph Font"/>
     <w:uiPriority w:val="1"/>
+    <w:semiHidden/>
     <w:unhideWhenUsed/>
   </w:style>
   <w:style w:type="table" w:default="1" w:styleId="a1">

</xml_diff>